<commit_message>
Minor edits for clarity
</commit_message>
<xml_diff>
--- a/Interior_Trim/floor_install.docx
+++ b/Interior_Trim/floor_install.docx
@@ -37,7 +37,7 @@
         <w:br/>
       </w:r>
       <w:r>
-        <w:t xml:space="preserve">    • 4½ to 5 boxes of flooring</w:t>
+        <w:t xml:space="preserve">    • 4½ to 5 boxes of flooring; use ripped planks if available</w:t>
       </w:r>
       <w:r>
         <w:br/>
@@ -73,7 +73,7 @@
         <w:pStyle w:val="FirstParagraph"/>
       </w:pPr>
       <w:r>
-        <w:t xml:space="preserve">• Assemble first row from three full lengths (or use 3 ripped pieces from a previous floor). The wide gray tongue on the long edge should face the interior of the home.</w:t>
+        <w:t xml:space="preserve">• Assemble first row from three full lengths (or use 3 ripped pieces from a previous floor). The wide gray tongue on the long edge should face the interior of the home. Engage short edges, and align exactly.</w:t>
       </w:r>
       <w:r>
         <w:br/>

</xml_diff>